<commit_message>
feat: validate native-block averaged PMSG SSO benchmark
</commit_message>
<xml_diff>
--- a/report/Vataleni_PMSG_SSO_Progress_Explainer.docx
+++ b/report/Vataleni_PMSG_SSO_Progress_Explainer.docx
@@ -75,7 +75,7 @@
           <w:color w:val="595959"/>
           <w:sz w:val="20"/>
         </w:rPr>
-        <w:t>Generated from fresh MATLAB/Simulink results - 13 August 2026</w:t>
+        <w:t>Generated from fresh MATLAB/Simulink results - 21 October 2026</w:t>
       </w:r>
     </w:p>
     <w:p>
@@ -109,7 +109,7 @@
       <w:r>
         <w:drawing>
           <wp:inline xmlns:a="http://schemas.openxmlformats.org/drawingml/2006/main" xmlns:pic="http://schemas.openxmlformats.org/drawingml/2006/picture">
-            <wp:extent cx="5852160" cy="2123642"/>
+            <wp:extent cx="5852160" cy="3989788"/>
             <wp:docPr id="1" name="Picture 1" descr="Figure 1. The repaired model's eight main engineering subsystems." title="top level"/>
             <wp:cNvGraphicFramePr>
               <a:graphicFrameLocks noChangeAspect="1"/>
@@ -130,7 +130,7 @@
                   <pic:spPr>
                     <a:xfrm>
                       <a:off x="0" y="0"/>
-                      <a:ext cx="5852160" cy="2123642"/>
+                      <a:ext cx="5852160" cy="3989788"/>
                     </a:xfrm>
                     <a:prstGeom prst="rect"/>
                   </pic:spPr>
@@ -864,7 +864,7 @@
           <w:rFonts w:ascii="Calibri" w:hAnsi="Calibri"/>
           <w:sz w:val="22"/>
         </w:rPr>
-        <w:t>Prony: a fitted damped sinusoid gives sigma = +0.05148 1/s before and -1.39367 1/s after.</w:t>
+        <w:t>Prony: a fitted damped sinusoid gives sigma = +0.05158 1/s before and -1.39358 1/s after.</w:t>
       </w:r>
     </w:p>
     <w:p>
@@ -923,7 +923,7 @@
           <w:rFonts w:ascii="Calibri" w:hAnsi="Calibri"/>
           <w:sz w:val="22"/>
         </w:rPr>
-        <w:t>The earlier SLX contained Level-2 MATLAB S-Function blocks whose external files were not available when a user opened the model. Those blocks were replaced by native Integrator blocks and embedded MATLAB Function equations inside the SLX. The stop time, fixed step, scenario defaults and initial conditions are also stored in the model, so pressing Run no longer depends on an initialization script or a pre-populated base workspace.</w:t>
+        <w:t>The earlier SLX contained Level-2 MATLAB S-Function blocks whose external files were not available when a user opened the model. The seven plant and controller equation groups now use connected native Simulink math blocks and native Integrators. One internal MATLAB Function block assembles diagnostics. The stop time, fixed step, scenario defaults and initial conditions are stored in the model, so pressing Run requires no initialization script or pre-populated base workspace.</w:t>
       </w:r>
     </w:p>
     <w:p>

</xml_diff>